<commit_message>
se agrgega la posibilidad de que el docente active o no la praduccion, el docente puede abrir los proyectos del alumno en modo lectura,se agrega un dashboard de avande el alumno,se pemite agregar retos al banco por csv
</commit_message>
<xml_diff>
--- a/docs/Manual-del-lenguaje.docx
+++ b/docs/Manual-del-lenguaje.docx
@@ -38,11 +38,11 @@
       </w:pPr>
       <w:r>
         <w:rPr>
-          <w:rFonts w:ascii="Calibri" w:hAnsi="Calibri" w:eastAsia="Calibri"/>
+          <w:rFonts w:ascii="Calibri" w:hAnsi="Calibri"/>
           <w:b w:val="0"/>
           <w:sz w:val="26"/>
         </w:rPr>
-        <w:t>Cómo escribir pseudocódigo, leer el diagrama de flujo y armar los bloques</w:t>
+        <w:t>Cómo escribir pseudocódigo, leer el diagrama de flujo, armar los bloques y traducir el algoritmo</w:t>
       </w:r>
     </w:p>
     <w:p>
@@ -52,11 +52,11 @@
       </w:pPr>
       <w:r>
         <w:rPr>
-          <w:rFonts w:ascii="Calibri" w:hAnsi="Calibri" w:eastAsia="Calibri"/>
+          <w:rFonts w:ascii="Calibri" w:hAnsi="Calibri"/>
           <w:b w:val="0"/>
           <w:sz w:val="24"/>
         </w:rPr>
-        <w:t>Este manual es para quien va a crear algoritmos. Explica cada instrucción, qué datos hay que poner, las palabras reservadas, las figuras del diagrama, los bloques del laboratorio y las funciones incluidas. Los dibujos usan los mismos colores que la aplicación.</w:t>
+        <w:t>Este manual es para quien va a crear algoritmos. Explica cada instrucción, qué datos hay que poner, las palabras reservadas, las figuras del diagrama, los bloques del laboratorio y las funciones incluidas, con un ejemplo en cada caso. El último capítulo explica el botón Traducir: genera el mismo algoritmo en otros lenguajes y no lo ejecuta.</w:t>
       </w:r>
     </w:p>
     <w:p>
@@ -66,11 +66,11 @@
       </w:pPr>
       <w:r>
         <w:rPr>
-          <w:rFonts w:ascii="Calibri" w:hAnsi="Calibri" w:eastAsia="Calibri"/>
+          <w:rFonts w:ascii="Calibri" w:hAnsi="Calibri"/>
           <w:b w:val="0"/>
           <w:sz w:val="22"/>
         </w:rPr>
-        <w:t>Octubre de 2026</w:t>
+        <w:t>17 de octubre de 2026</w:t>
       </w:r>
     </w:p>
     <w:p>
@@ -13074,6 +13074,554 @@
           <w:sz w:val="24"/>
         </w:rPr>
         <w:t>El mensaje indica la línea y la columna. En el editor puedes pulsar el diagnóstico para ir a ese lugar. En el laboratorio, el mismo mensaje señala el bloque.</w:t>
+      </w:r>
+    </w:p>
+    <w:p>
+      <w:pPr>
+        <w:pStyle w:val="Heading1"/>
+      </w:pPr>
+      <w:r>
+        <w:rPr>
+          <w:rFonts w:ascii="Calibri" w:hAnsi="Calibri"/>
+          <w:b/>
+          <w:color w:val="3D2A5C"/>
+          <w:sz w:val="44"/>
+        </w:rPr>
+        <w:t>12. Traducir el algoritmo</w:t>
+      </w:r>
+    </w:p>
+    <w:p>
+      <w:r>
+        <w:t>El botón Traducir está en la barra del banco de trabajo. Pide el código del algoritmo abierto en otros lenguajes de programación. Usa el mismo árbol que Validar. No ejecuta el programa y no cambia el pseudocódigo guardado.</w:t>
+      </w:r>
+    </w:p>
+    <w:p>
+      <w:r>
+        <w:t>Si el algoritmo tiene errores, no aparece código: hay que corregirlos. Una advertencia no lo impide. Los lenguajes son Python, JavaScript, TypeScript, Java, C, C++ y C#. Cada uno va en una pestaña. Ampliar agranda el recuadro y Copiar deja el texto en el portapapeles.</w:t>
+      </w:r>
+    </w:p>
+    <w:p>
+      <w:r>
+        <w:t>Este algoritmo:</w:t>
+      </w:r>
+    </w:p>
+    <w:tbl>
+      <w:tblPr>
+        <w:tblW w:type="auto" w:w="0"/>
+        <w:tblLook w:firstColumn="1" w:firstRow="1" w:lastColumn="0" w:lastRow="0" w:noHBand="0" w:noVBand="1" w:val="04A0"/>
+      </w:tblPr>
+      <w:tblGrid>
+        <w:gridCol w:w="9866"/>
+      </w:tblGrid>
+      <w:tr>
+        <w:tc>
+          <w:tcPr>
+            <w:tcW w:type="dxa" w:w="9866"/>
+            <w:shd w:val="clear" w:fill="F7F4EC"/>
+            <w:tcW w:w="9866" w:type="dxa"/>
+          </w:tcPr>
+          <w:p>
+            <w:pPr>
+              <w:spacing w:before="0" w:after="0"/>
+            </w:pPr>
+            <w:r>
+              <w:rPr>
+                <w:rFonts w:ascii="Menlo" w:hAnsi="Menlo" w:eastAsia="Menlo"/>
+                <w:b w:val="0"/>
+                <w:sz w:val="21"/>
+              </w:rPr>
+              <w:t>Algoritmo Elegir</w:t>
+            </w:r>
+          </w:p>
+          <w:p>
+            <w:pPr>
+              <w:spacing w:before="0" w:after="0"/>
+            </w:pPr>
+            <w:r>
+              <w:rPr>
+                <w:rFonts w:ascii="Menlo" w:hAnsi="Menlo" w:eastAsia="Menlo"/>
+                <w:b w:val="0"/>
+                <w:sz w:val="21"/>
+              </w:rPr>
+              <w:t xml:space="preserve">    Definir n Como Entero;</w:t>
+            </w:r>
+          </w:p>
+          <w:p>
+            <w:pPr>
+              <w:spacing w:before="0" w:after="0"/>
+            </w:pPr>
+            <w:r>
+              <w:rPr>
+                <w:rFonts w:ascii="Menlo" w:hAnsi="Menlo" w:eastAsia="Menlo"/>
+                <w:b w:val="0"/>
+                <w:sz w:val="21"/>
+              </w:rPr>
+              <w:t xml:space="preserve">    n &lt;- 2;</w:t>
+            </w:r>
+          </w:p>
+          <w:p>
+            <w:pPr>
+              <w:spacing w:before="0" w:after="0"/>
+            </w:pPr>
+            <w:r>
+              <w:rPr>
+                <w:rFonts w:ascii="Menlo" w:hAnsi="Menlo" w:eastAsia="Menlo"/>
+                <w:b w:val="0"/>
+                <w:sz w:val="21"/>
+              </w:rPr>
+              <w:t xml:space="preserve">    Segun n Hacer</w:t>
+            </w:r>
+          </w:p>
+          <w:p>
+            <w:pPr>
+              <w:spacing w:before="0" w:after="0"/>
+            </w:pPr>
+            <w:r>
+              <w:rPr>
+                <w:rFonts w:ascii="Menlo" w:hAnsi="Menlo" w:eastAsia="Menlo"/>
+                <w:b w:val="0"/>
+                <w:sz w:val="21"/>
+              </w:rPr>
+              <w:t xml:space="preserve">        1: Escribir "uno";</w:t>
+            </w:r>
+          </w:p>
+          <w:p>
+            <w:pPr>
+              <w:spacing w:before="0" w:after="0"/>
+            </w:pPr>
+            <w:r>
+              <w:rPr>
+                <w:rFonts w:ascii="Menlo" w:hAnsi="Menlo" w:eastAsia="Menlo"/>
+                <w:b w:val="0"/>
+                <w:sz w:val="21"/>
+              </w:rPr>
+              <w:t xml:space="preserve">        2, 3: Escribir "varios";</w:t>
+            </w:r>
+          </w:p>
+          <w:p>
+            <w:pPr>
+              <w:spacing w:before="0" w:after="0"/>
+            </w:pPr>
+            <w:r>
+              <w:rPr>
+                <w:rFonts w:ascii="Menlo" w:hAnsi="Menlo" w:eastAsia="Menlo"/>
+                <w:b w:val="0"/>
+                <w:sz w:val="21"/>
+              </w:rPr>
+              <w:t xml:space="preserve">    De Otro Modo:</w:t>
+            </w:r>
+          </w:p>
+          <w:p>
+            <w:pPr>
+              <w:spacing w:before="0" w:after="0"/>
+            </w:pPr>
+            <w:r>
+              <w:rPr>
+                <w:rFonts w:ascii="Menlo" w:hAnsi="Menlo" w:eastAsia="Menlo"/>
+                <w:b w:val="0"/>
+                <w:sz w:val="21"/>
+              </w:rPr>
+              <w:t xml:space="preserve">        Escribir "otro";</w:t>
+            </w:r>
+          </w:p>
+          <w:p>
+            <w:pPr>
+              <w:spacing w:before="0" w:after="0"/>
+            </w:pPr>
+            <w:r>
+              <w:rPr>
+                <w:rFonts w:ascii="Menlo" w:hAnsi="Menlo" w:eastAsia="Menlo"/>
+                <w:b w:val="0"/>
+                <w:sz w:val="21"/>
+              </w:rPr>
+              <w:t xml:space="preserve">    FinSegun</w:t>
+            </w:r>
+          </w:p>
+          <w:p>
+            <w:pPr>
+              <w:spacing w:before="0" w:after="0"/>
+            </w:pPr>
+            <w:r>
+              <w:rPr>
+                <w:rFonts w:ascii="Menlo" w:hAnsi="Menlo" w:eastAsia="Menlo"/>
+                <w:b w:val="0"/>
+                <w:sz w:val="21"/>
+              </w:rPr>
+              <w:t>FinAlgoritmo</w:t>
+            </w:r>
+          </w:p>
+        </w:tc>
+      </w:tr>
+    </w:tbl>
+    <w:p/>
+    <w:p>
+      <w:r>
+        <w:t>En Python el Según sale como match, con case 2 | 3. En los otros seis lenguajes sale como switch, con case 2, case 3, break y default. El resultado de ese ejemplo es varios.</w:t>
+      </w:r>
+    </w:p>
+    <w:p>
+      <w:pPr>
+        <w:pStyle w:val="Heading2"/>
+      </w:pPr>
+      <w:r>
+        <w:rPr>
+          <w:rFonts w:ascii="Calibri" w:hAnsi="Calibri"/>
+          <w:b/>
+          <w:color w:val="3D2A5C"/>
+          <w:sz w:val="32"/>
+        </w:rPr>
+        <w:t>12.1 Qué se conserva</w:t>
+      </w:r>
+    </w:p>
+    <w:p>
+      <w:pPr>
+        <w:pStyle w:val="ListBullet"/>
+      </w:pPr>
+      <w:r>
+        <w:rPr>
+          <w:rFonts w:ascii="Calibri" w:hAnsi="Calibri"/>
+          <w:b w:val="0"/>
+          <w:sz w:val="24"/>
+        </w:rPr>
+        <w:t>La estructura: Si, Según, Mientras, Repetir, Para, funciones y procedimientos.</w:t>
+      </w:r>
+    </w:p>
+    <w:p>
+      <w:pPr>
+        <w:pStyle w:val="ListBullet"/>
+      </w:pPr>
+      <w:r>
+        <w:rPr>
+          <w:rFonts w:ascii="Calibri" w:hAnsi="Calibri"/>
+          <w:b w:val="0"/>
+          <w:sz w:val="24"/>
+        </w:rPr>
+        <w:t>Los comentarios, de línea y de bloque.</w:t>
+      </w:r>
+    </w:p>
+    <w:p>
+      <w:pPr>
+        <w:pStyle w:val="ListBullet"/>
+      </w:pPr>
+      <w:r>
+        <w:rPr>
+          <w:rFonts w:ascii="Calibri" w:hAnsi="Calibri"/>
+          <w:b w:val="0"/>
+          <w:sz w:val="24"/>
+        </w:rPr>
+        <w:t>La base de índices del algoritmo. Si empieza en 1, el código generado también cuenta desde 1.</w:t>
+      </w:r>
+    </w:p>
+    <w:p>
+      <w:pPr>
+        <w:pStyle w:val="ListBullet"/>
+      </w:pPr>
+      <w:r>
+        <w:rPr>
+          <w:rFonts w:ascii="Calibri" w:hAnsi="Calibri"/>
+          <w:b w:val="0"/>
+          <w:sz w:val="24"/>
+        </w:rPr>
+        <w:t>DIV y MOD hacia cero. -7 DIV 2 sigue valiendo -3 y -7 MOD 2 sigue valiendo -1.</w:t>
+      </w:r>
+    </w:p>
+    <w:p>
+      <w:pPr>
+        <w:pStyle w:val="ListBullet"/>
+      </w:pPr>
+      <w:r>
+        <w:rPr>
+          <w:rFonts w:ascii="Calibri" w:hAnsi="Calibri"/>
+          <w:b w:val="0"/>
+          <w:sz w:val="24"/>
+        </w:rPr>
+        <w:t>Un parámetro por referencia. En C es un puntero, en C++ una referencia y en C# va con ref. En Python, JavaScript, TypeScript y Java va dentro de una caja, para poder cambiar el original.</w:t>
+      </w:r>
+    </w:p>
+    <w:p>
+      <w:pPr>
+        <w:pStyle w:val="ListBullet"/>
+      </w:pPr>
+      <w:r>
+        <w:rPr>
+          <w:rFonts w:ascii="Calibri" w:hAnsi="Calibri"/>
+          <w:b w:val="0"/>
+          <w:sz w:val="24"/>
+        </w:rPr>
+        <w:t>La biblioteca. Abs, Raíz, Longitud y el resto dan el mismo resultado que en Traza, escritos en la forma de cada lenguaje.</w:t>
+      </w:r>
+    </w:p>
+    <w:p>
+      <w:pPr>
+        <w:pStyle w:val="ListBullet"/>
+      </w:pPr>
+      <w:r>
+        <w:rPr>
+          <w:rFonts w:ascii="Calibri" w:hAnsi="Calibri"/>
+          <w:b w:val="0"/>
+          <w:sz w:val="24"/>
+        </w:rPr>
+        <w:t>Los nombres que inventas. Si chocan con una palabra del lenguaje de destino, se les añade un sufijo para que el programa compile.</w:t>
+      </w:r>
+    </w:p>
+    <w:p>
+      <w:pPr>
+        <w:pStyle w:val="Heading2"/>
+      </w:pPr>
+      <w:r>
+        <w:rPr>
+          <w:rFonts w:ascii="Calibri" w:hAnsi="Calibri"/>
+          <w:b/>
+          <w:color w:val="3D2A5C"/>
+          <w:sz w:val="32"/>
+        </w:rPr>
+        <w:t>12.2 Según</w:t>
+      </w:r>
+    </w:p>
+    <w:p>
+      <w:r>
+        <w:t>Según no siempre cabe en un switch. Cuando no cabe, sale una cadena de Si, y el resultado es el mismo.</w:t>
+      </w:r>
+    </w:p>
+    <w:p>
+      <w:pPr>
+        <w:pStyle w:val="ListBullet"/>
+      </w:pPr>
+      <w:r>
+        <w:rPr>
+          <w:rFonts w:ascii="Calibri" w:hAnsi="Calibri"/>
+          <w:b w:val="0"/>
+          <w:sz w:val="24"/>
+        </w:rPr>
+        <w:t>Python usa match con el tipo que sea.</w:t>
+      </w:r>
+    </w:p>
+    <w:p>
+      <w:pPr>
+        <w:pStyle w:val="ListBullet"/>
+      </w:pPr>
+      <w:r>
+        <w:rPr>
+          <w:rFonts w:ascii="Calibri" w:hAnsi="Calibri"/>
+          <w:b w:val="0"/>
+          <w:sz w:val="24"/>
+        </w:rPr>
+        <w:t>Un entero o un caracter caben en el switch de JavaScript, TypeScript, Java, C, C++ y C#.</w:t>
+      </w:r>
+    </w:p>
+    <w:p>
+      <w:pPr>
+        <w:pStyle w:val="ListBullet"/>
+      </w:pPr>
+      <w:r>
+        <w:rPr>
+          <w:rFonts w:ascii="Calibri" w:hAnsi="Calibri"/>
+          <w:b w:val="0"/>
+          <w:sz w:val="24"/>
+        </w:rPr>
+        <w:t>Una cadena cabe en JavaScript, TypeScript, Java y C#. En C y C++ se compara el texto, porque su switch no acepta cadenas.</w:t>
+      </w:r>
+    </w:p>
+    <w:p>
+      <w:pPr>
+        <w:pStyle w:val="ListBullet"/>
+      </w:pPr>
+      <w:r>
+        <w:rPr>
+          <w:rFonts w:ascii="Calibri" w:hAnsi="Calibri"/>
+          <w:b w:val="0"/>
+          <w:sz w:val="24"/>
+        </w:rPr>
+        <w:t>Un real cabe en Python, JavaScript y TypeScript. En Java, C, C++ y C# sale como Si.</w:t>
+      </w:r>
+    </w:p>
+    <w:p>
+      <w:pPr>
+        <w:pStyle w:val="ListBullet"/>
+      </w:pPr>
+      <w:r>
+        <w:rPr>
+          <w:rFonts w:ascii="Calibri" w:hAnsi="Calibri"/>
+          <w:b w:val="0"/>
+          <w:sz w:val="24"/>
+        </w:rPr>
+        <w:t>Un lógico cabe en todos menos en Java, que sale como Si.</w:t>
+      </w:r>
+    </w:p>
+    <w:p>
+      <w:pPr>
+        <w:pStyle w:val="ListBullet"/>
+      </w:pPr>
+      <w:r>
+        <w:rPr>
+          <w:rFonts w:ascii="Calibri" w:hAnsi="Calibri"/>
+          <w:b w:val="0"/>
+          <w:sz w:val="24"/>
+        </w:rPr>
+        <w:t>Cada caso termina para no caer en el siguiente. De Otro Modo es el caso por defecto. Si no hay De Otro Modo y ningún caso coincide, no se hace nada.</w:t>
+      </w:r>
+    </w:p>
+    <w:p>
+      <w:pPr>
+        <w:pStyle w:val="Heading2"/>
+      </w:pPr>
+      <w:r>
+        <w:rPr>
+          <w:rFonts w:ascii="Calibri" w:hAnsi="Calibri"/>
+          <w:b/>
+          <w:color w:val="3D2A5C"/>
+          <w:sz w:val="32"/>
+        </w:rPr>
+        <w:t>12.3 Ciclos</w:t>
+      </w:r>
+    </w:p>
+    <w:p>
+      <w:pPr>
+        <w:pStyle w:val="ListBullet"/>
+      </w:pPr>
+      <w:r>
+        <w:rPr>
+          <w:rFonts w:ascii="Calibri" w:hAnsi="Calibri"/>
+          <w:b w:val="0"/>
+          <w:sz w:val="24"/>
+        </w:rPr>
+        <w:t>Mientras sale como while. Si la condición es falsa desde el principio, el cuerpo no se ejecuta.</w:t>
+      </w:r>
+    </w:p>
+    <w:p>
+      <w:pPr>
+        <w:pStyle w:val="ListBullet"/>
+      </w:pPr>
+      <w:r>
+        <w:rPr>
+          <w:rFonts w:ascii="Calibri" w:hAnsi="Calibri"/>
+          <w:b w:val="0"/>
+          <w:sz w:val="24"/>
+        </w:rPr>
+        <w:t>Repetir sale como do y while en los lenguajes que lo tienen. La condición se niega, porque Hasta Que para cuando se cumple. El cuerpo corre al menos una vez.</w:t>
+      </w:r>
+    </w:p>
+    <w:p>
+      <w:pPr>
+        <w:pStyle w:val="ListBullet"/>
+      </w:pPr>
+      <w:r>
+        <w:rPr>
+          <w:rFonts w:ascii="Calibri" w:hAnsi="Calibri"/>
+          <w:b w:val="0"/>
+          <w:sz w:val="24"/>
+        </w:rPr>
+        <w:t>Python no tiene do while. Repetir sale como while True y un break cuando la condición se cumple.</w:t>
+      </w:r>
+    </w:p>
+    <w:p>
+      <w:pPr>
+        <w:pStyle w:val="ListBullet"/>
+      </w:pPr>
+      <w:r>
+        <w:rPr>
+          <w:rFonts w:ascii="Calibri" w:hAnsi="Calibri"/>
+          <w:b w:val="0"/>
+          <w:sz w:val="24"/>
+        </w:rPr>
+        <w:t>Para incluye el valor inicial y el final. Para i &lt;- 1 Hasta 3 entra con 1, 2 y 3.</w:t>
+      </w:r>
+    </w:p>
+    <w:p>
+      <w:pPr>
+        <w:pStyle w:val="ListBullet"/>
+      </w:pPr>
+      <w:r>
+        <w:rPr>
+          <w:rFonts w:ascii="Calibri" w:hAnsi="Calibri"/>
+          <w:b w:val="0"/>
+          <w:sz w:val="24"/>
+        </w:rPr>
+        <w:t>Si el paso es positivo, se sigue mientras la variable sea menor o igual que el final. Si es negativo, mientras sea mayor o igual. El paso 1 suma uno y el paso -1 resta uno.</w:t>
+      </w:r>
+    </w:p>
+    <w:p>
+      <w:pPr>
+        <w:pStyle w:val="ListBullet"/>
+      </w:pPr>
+      <w:r>
+        <w:rPr>
+          <w:rFonts w:ascii="Calibri" w:hAnsi="Calibri"/>
+          <w:b w:val="0"/>
+          <w:sz w:val="24"/>
+        </w:rPr>
+        <w:t>Si el paso no es un número escrito en el fuente, el código mira en cada vuelta si es positivo o negativo.</w:t>
+      </w:r>
+    </w:p>
+    <w:p>
+      <w:pPr>
+        <w:pStyle w:val="ListBullet"/>
+      </w:pPr>
+      <w:r>
+        <w:rPr>
+          <w:rFonts w:ascii="Calibri" w:hAnsi="Calibri"/>
+          <w:b w:val="0"/>
+          <w:sz w:val="24"/>
+        </w:rPr>
+        <w:t>En Python se usa range. El extremo se desplaza para que el último valor entre: Hasta 3 con paso 1 llega hasta 3, no se queda en 2.</w:t>
+      </w:r>
+    </w:p>
+    <w:p>
+      <w:pPr>
+        <w:pStyle w:val="Heading2"/>
+      </w:pPr>
+      <w:r>
+        <w:rPr>
+          <w:rFonts w:ascii="Calibri" w:hAnsi="Calibri"/>
+          <w:b/>
+          <w:color w:val="3D2A5C"/>
+          <w:sz w:val="32"/>
+        </w:rPr>
+        <w:t>12.4 Dónde se genera</w:t>
+      </w:r>
+    </w:p>
+    <w:p>
+      <w:r>
+        <w:t>En el navegador, Traducir pide el código al servidor. En la aplicación de escritorio lo genera la propia máquina, con el mismo núcleo. En los dos casos el pseudocódigo guardado no se modifica y el programa generado no se ejecuta desde Traza.</w:t>
+      </w:r>
+    </w:p>
+    <w:p>
+      <w:r>
+        <w:t>Actualizar, en la misma barra, vuelve a leer proyectos y algoritmos del servidor. Sirve cuando la misma cuenta está abierta en otra ventana. En esta ventana suelta lo que todavía no se guardó.</w:t>
+      </w:r>
+    </w:p>
+    <w:p>
+      <w:pPr>
+        <w:pStyle w:val="Heading2"/>
+      </w:pPr>
+      <w:r>
+        <w:rPr>
+          <w:rFonts w:ascii="Calibri" w:hAnsi="Calibri"/>
+          <w:b/>
+          <w:color w:val="3D2A5C"/>
+          <w:sz w:val="32"/>
+        </w:rPr>
+        <w:t>12.5 Si el docente la apaga</w:t>
+      </w:r>
+    </w:p>
+    <w:p>
+      <w:r>
+        <w:rPr>
+          <w:rFonts w:ascii="Calibri" w:hAnsi="Calibri"/>
+          <w:b w:val="0"/>
+          <w:sz w:val="24"/>
+        </w:rPr>
+        <w:t>En Comunidades, el docente puede apagar la traducción para todo el grupo o solo para un alumno. Si está apagada, Traducir no muestra código y avisa que el docente la desactivó. El pseudocódigo se sigue escribiendo, validando y ejecutando igual.</w:t>
+      </w:r>
+    </w:p>
+    <w:p>
+      <w:r>
+        <w:rPr>
+          <w:rFonts w:ascii="Calibri" w:hAnsi="Calibri"/>
+          <w:b w:val="0"/>
+          <w:sz w:val="24"/>
+        </w:rPr>
+        <w:t>Repaso, en el banco de trabajo del docente, abre los proyectos del alumno para verlos. No los modifica y no crea una versión al ejecutarlos.</w:t>
       </w:r>
     </w:p>
     <w:sectPr>

</xml_diff>

<commit_message>
se actualiza , creacion de botones con informacion de operadores, y manuales, se permite la descarga de retos dentro del banco de retos
</commit_message>
<xml_diff>
--- a/docs/Manual-del-lenguaje.docx
+++ b/docs/Manual-del-lenguaje.docx
@@ -70,7 +70,7 @@
           <w:b w:val="0"/>
           <w:sz w:val="22"/>
         </w:rPr>
-        <w:t>17 de octubre de 2026</w:t>
+        <w:t>19 de octubre de 2026</w:t>
       </w:r>
     </w:p>
     <w:p>
@@ -13622,6 +13622,50 @@
           <w:sz w:val="24"/>
         </w:rPr>
         <w:t>Repaso, en el banco de trabajo del docente, abre los proyectos del alumno para verlos. No los modifica y no crea una versión al ejecutarlos.</w:t>
+      </w:r>
+    </w:p>
+    <w:p>
+      <w:pPr>
+        <w:pStyle w:val="Heading2"/>
+      </w:pPr>
+      <w:r>
+        <w:rPr>
+          <w:rFonts w:ascii="Calibri" w:hAnsi="Calibri"/>
+          <w:b/>
+          <w:color w:val="3D2A5C"/>
+          <w:sz w:val="32"/>
+        </w:rPr>
+        <w:t>12.6 Pegar y el nivel de la cuenta</w:t>
+      </w:r>
+    </w:p>
+    <w:p>
+      <w:r>
+        <w:rPr>
+          <w:rFonts w:ascii="Calibri" w:hAnsi="Calibri"/>
+          <w:b w:val="0"/>
+          <w:sz w:val="24"/>
+        </w:rPr>
+        <w:t>Pegar no cambia el lenguaje. Si el docente lo apaga para el grupo o para un alumno, el editor deja escribir y no acepta texto pegado. La misma regla vale si el nivel de la cuenta no incluye pegar.</w:t>
+      </w:r>
+    </w:p>
+    <w:p>
+      <w:r>
+        <w:rPr>
+          <w:rFonts w:ascii="Calibri" w:hAnsi="Calibri"/>
+          <w:b w:val="0"/>
+          <w:sz w:val="24"/>
+        </w:rPr>
+        <w:t>El nivel también puede apagar Traducir. En ese caso el botón no genera código, aunque la comunidad lo tenga habilitado. El nivel gratis de alumno no incluye traducir, el diagrama, depurar ni descargar. Esas funciones están en el nivel premium, y el administrador decide el precio y si el navegador puede abrir la aplicación.</w:t>
+      </w:r>
+    </w:p>
+    <w:p>
+      <w:r>
+        <w:rPr>
+          <w:rFonts w:ascii="Calibri" w:hAnsi="Calibri"/>
+          <w:b w:val="0"/>
+          <w:sz w:val="24"/>
+        </w:rPr>
+        <w:t>Si el navegador no está permitido, al entrar solo se ve la cuenta: el tipo, la foto, la contraseña y los días que faltan. El editor, Traducir y el laboratorio se usan en la aplicación de escritorio. La foto es JPG o PNG, de hasta 120 KB. Cambiar la contraseña pide la actual.</w:t>
       </w:r>
     </w:p>
     <w:sectPr>

</xml_diff>

<commit_message>
Cambio de imagen y logo de Aulivana-FCDesign
</commit_message>
<xml_diff>
--- a/docs/Manual-del-lenguaje.docx
+++ b/docs/Manual-del-lenguaje.docx
@@ -13,7 +13,7 @@
           <w:b/>
           <w:sz w:val="28"/>
         </w:rPr>
-        <w:t>TRAZA</w:t>
+        <w:t>Aulivana-FCDdesign</w:t>
       </w:r>
     </w:p>
     <w:p>
@@ -11508,7 +11508,7 @@
                 <w:b w:val="0"/>
                 <w:sz w:val="21"/>
               </w:rPr>
-              <w:t>Escribir Subcadena("Traza", 1, 3);</w:t>
+              <w:t>Escribir Subcadena("Aulivana-FCDdesign", 1, 3);</w:t>
             </w:r>
           </w:p>
         </w:tc>
@@ -11529,7 +11529,7 @@
           <w:b w:val="0"/>
           <w:sz w:val="24"/>
         </w:rPr>
-        <w:t>Con la base en 1 escribe Tra. Con la base en 0, el 1 ya no es la primera letra.</w:t>
+        <w:t>Con la base en 1 escribe Aul. Con la base en 0, el 1 ya no es la primera letra.</w:t>
       </w:r>
     </w:p>
     <w:p>
@@ -13363,7 +13363,7 @@
           <w:b w:val="0"/>
           <w:sz w:val="24"/>
         </w:rPr>
-        <w:t>La biblioteca. Abs, Raíz, Longitud y el resto dan el mismo resultado que en Traza, escritos en la forma de cada lenguaje.</w:t>
+        <w:t>La biblioteca. Abs, Raíz, Longitud y el resto dan el mismo resultado que en Aulivana-FCDdesign, escritos en la forma de cada lenguaje.</w:t>
       </w:r>
     </w:p>
     <w:p>
@@ -13597,7 +13597,7 @@
     </w:p>
     <w:p>
       <w:r>
-        <w:t>En el navegador, Traducir pide el código al servidor. En la aplicación de escritorio lo genera la propia máquina, con el mismo núcleo. En los dos casos el pseudocódigo guardado no se modifica y el programa generado no se ejecuta desde Traza.</w:t>
+        <w:t>En el navegador, Traducir pide el código al servidor. En la aplicación de escritorio lo genera la propia máquina, con el mismo núcleo. En los dos casos el pseudocódigo guardado no se modifica y el programa generado no se ejecuta desde Aulivana-FCDdesign.</w:t>
       </w:r>
     </w:p>
     <w:p>
@@ -13735,7 +13735,7 @@
         <w:color w:val="6A3D86"/>
         <w:sz w:val="20"/>
       </w:rPr>
-      <w:t>Traza  ·  Manual del lenguaje</w:t>
+      <w:t>Aulivana-FCDdesign  ·  Manual del lenguaje</w:t>
     </w:r>
   </w:p>
 </w:hdr>

</xml_diff>